<commit_message>
Documentar acceso web temporal en red local
</commit_message>
<xml_diff>
--- a/Guia_03_Guion_defensa.docx
+++ b/Guia_03_Guion_defensa.docx
@@ -915,6 +915,21 @@
         <w:t>Si el tiempo lo permite, enseñar la extensión llamando a la misma URL del backend.</w:t>
       </w:r>
     </w:p>
+    <w:p>
+      <w:pPr>
+        <w:pStyle w:val="ListNumber"/>
+      </w:pPr>
+      <w:r>
+        <w:rPr>
+          <w:rFonts w:ascii="Calibri" w:hAnsi="Calibri"/>
+          <w:b w:val="0"/>
+          <w:i w:val="0"/>
+          <w:color w:val="1F2937"/>
+          <w:sz w:val="22"/>
+        </w:rPr>
+        <w:t>Opcionalmente, abrir la web desde un móvil de la misma red privada para explicar que el navegador es un cliente; mantener el backend en loopback y cerrar el acceso LAN al terminar.</w:t>
+      </w:r>
+    </w:p>
     <w:tbl>
       <w:tblPr>
         <w:tblW w:type="dxa" w:w="9360"/>
@@ -1193,6 +1208,45 @@
                 <w:sz w:val="22"/>
               </w:rPr>
               <w:t>Sí. Streamlit, extensión y monitor son clientes HTTP; backend_server analiza y mantiene una versión activa por idioma. En local ambos lados están en el mismo equipo, pero siguen siendo procesos y responsabilidades separadas.</w:t>
+            </w:r>
+          </w:p>
+        </w:tc>
+      </w:tr>
+      <w:tr>
+        <w:trPr>
+          <w:cantSplit/>
+        </w:trPr>
+        <w:tc>
+          <w:tcPr>
+            <w:tcW w:type="dxa" w:w="3300"/>
+          </w:tcPr>
+          <w:p>
+            <w:r>
+              <w:rPr>
+                <w:rFonts w:ascii="Calibri" w:hAnsi="Calibri"/>
+                <w:b w:val="0"/>
+                <w:i w:val="0"/>
+                <w:color w:val="1F2937"/>
+                <w:sz w:val="22"/>
+              </w:rPr>
+              <w:t>¿Puede entrar un móvil?</w:t>
+            </w:r>
+          </w:p>
+        </w:tc>
+        <w:tc>
+          <w:tcPr>
+            <w:tcW w:type="dxa" w:w="6060"/>
+          </w:tcPr>
+          <w:p>
+            <w:r>
+              <w:rPr>
+                <w:rFonts w:ascii="Calibri" w:hAnsi="Calibri"/>
+                <w:b w:val="0"/>
+                <w:i w:val="0"/>
+                <w:color w:val="1F2937"/>
+                <w:sz w:val="22"/>
+              </w:rPr>
+              <w:t>Sí, si comparte una LAN privada y Streamlit se inicia en 0.0.0.0:8501. El móvil abre la IP del equipo; el backend sigue en 127.0.0.1:8766. No es un despliegue público y la web no tiene autenticación multiusuario.</w:t>
             </w:r>
           </w:p>
         </w:tc>
@@ -1493,6 +1547,21 @@
           <w:sz w:val="22"/>
         </w:rPr>
         <w:t>Comprobar que backend y web arrancan por separado y que /health muestra las versiones.</w:t>
+      </w:r>
+    </w:p>
+    <w:p>
+      <w:pPr>
+        <w:pStyle w:val="ListBullet"/>
+      </w:pPr>
+      <w:r>
+        <w:rPr>
+          <w:rFonts w:ascii="Calibri" w:hAnsi="Calibri"/>
+          <w:b w:val="0"/>
+          <w:i w:val="0"/>
+          <w:color w:val="1F2937"/>
+          <w:sz w:val="22"/>
+        </w:rPr>
+        <w:t>Si se enseña el acceso móvil, probar antes la misma Wi-Fi, la IP privada y el firewall; cerrar Streamlit al terminar.</w:t>
       </w:r>
     </w:p>
     <w:p>

</xml_diff>